<commit_message>
docs: CLAUDE-3 sync for helixd /health+/healthz, config-driven worker deploy, etcd/kafka ports
helixd now serves /health and /healthz as aliases of /status
(cmd/helixd/main.go) — document them in USER_MANUAL.md (env table, health
& observability table, curl example, file-map, and the operational-pattern
note that previously listed /healthz as not-wired).

Operations guide: add the config-driven worker deployment path
(deploy/cluster.env + deploy/deploy-workers.sh) with the loginctl
enable-linger requirement, and update the etcd port note to the published
multi-member set (2379/2479/2579, peers 2380/2381/2382) plus the kafka
dual-listener host ports (9092/9093/9094).

USER_MANUAL.md exports (html/pdf/docx) regenerated via docs_chain sync;
verify --all reaches exit 0. Evidence: qa-results/live-20260622/docs_sync2/.

Co-Authored-By: Claude Opus 4.8 (1M context) <noreply@anthropic.com>
</commit_message>
<xml_diff>
--- a/docs/export/USER_MANUAL.docx
+++ b/docs/export/USER_MANUAL.docx
@@ -2266,7 +2266,37 @@
               <w:t xml:space="preserve"> </w:t>
             </w:r>
             <w:r>
-              <w:t xml:space="preserve">HTTP surface (</w:t>
+              <w:t xml:space="preserve">HTTP surface — also serves the</w:t>
+            </w:r>
+            <w:r>
+              <w:t xml:space="preserve"> </w:t>
+            </w:r>
+            <w:r>
+              <w:rPr>
+                <w:rStyle w:val="VerbatimChar"/>
+              </w:rPr>
+              <w:t xml:space="preserve">/health</w:t>
+            </w:r>
+            <w:r>
+              <w:t xml:space="preserve"> </w:t>
+            </w:r>
+            <w:r>
+              <w:t xml:space="preserve">and</w:t>
+            </w:r>
+            <w:r>
+              <w:t xml:space="preserve"> </w:t>
+            </w:r>
+            <w:r>
+              <w:rPr>
+                <w:rStyle w:val="VerbatimChar"/>
+              </w:rPr>
+              <w:t xml:space="preserve">/healthz</w:t>
+            </w:r>
+            <w:r>
+              <w:t xml:space="preserve"> </w:t>
+            </w:r>
+            <w:r>
+              <w:t xml:space="preserve">aliases (</w:t>
             </w:r>
             <w:r>
               <w:rPr>
@@ -5525,16 +5555,70 @@
               </w:rPr>
               <w:t xml:space="preserve">GET /status</w:t>
             </w:r>
-          </w:p>
-        </w:tc>
-        <w:tc>
-          <w:tcPr/>
-          <w:p>
-            <w:pPr>
-              <w:pStyle w:val="Compact"/>
-            </w:pPr>
-            <w:r>
-              <w:t xml:space="preserve">Aggregated daemon + subservice reachability JSON</w:t>
+            <w:r>
+              <w:t xml:space="preserve"> </w:t>
+            </w:r>
+            <w:r>
+              <w:t xml:space="preserve">(aliases</w:t>
+            </w:r>
+            <w:r>
+              <w:t xml:space="preserve"> </w:t>
+            </w:r>
+            <w:r>
+              <w:rPr>
+                <w:rStyle w:val="VerbatimChar"/>
+              </w:rPr>
+              <w:t xml:space="preserve">GET /health</w:t>
+            </w:r>
+            <w:r>
+              <w:t xml:space="preserve">,</w:t>
+            </w:r>
+            <w:r>
+              <w:t xml:space="preserve"> </w:t>
+            </w:r>
+            <w:r>
+              <w:rPr>
+                <w:rStyle w:val="VerbatimChar"/>
+              </w:rPr>
+              <w:t xml:space="preserve">GET /healthz</w:t>
+            </w:r>
+            <w:r>
+              <w:t xml:space="preserve">)</w:t>
+            </w:r>
+          </w:p>
+        </w:tc>
+        <w:tc>
+          <w:tcPr/>
+          <w:p>
+            <w:pPr>
+              <w:pStyle w:val="Compact"/>
+            </w:pPr>
+            <w:r>
+              <w:t xml:space="preserve">Aggregated daemon + subservice reachability JSON; the</w:t>
+            </w:r>
+            <w:r>
+              <w:t xml:space="preserve"> </w:t>
+            </w:r>
+            <w:r>
+              <w:rPr>
+                <w:rStyle w:val="VerbatimChar"/>
+              </w:rPr>
+              <w:t xml:space="preserve">/health</w:t>
+            </w:r>
+            <w:r>
+              <w:t xml:space="preserve">+</w:t>
+            </w:r>
+            <w:r>
+              <w:rPr>
+                <w:rStyle w:val="VerbatimChar"/>
+              </w:rPr>
+              <w:t xml:space="preserve">/healthz</w:t>
+            </w:r>
+            <w:r>
+              <w:t xml:space="preserve"> </w:t>
+            </w:r>
+            <w:r>
+              <w:t xml:space="preserve">aliases let k8s/orchestrator probes hit the conventional paths</w:t>
             </w:r>
           </w:p>
         </w:tc>
@@ -5763,7 +5847,7 @@
         <w:rPr>
           <w:rStyle w:val="CommentTok"/>
         </w:rPr>
-        <w:t xml:space="preserve"># helixd</w:t>
+        <w:t xml:space="preserve"># helixd (also /health, /healthz)</w:t>
       </w:r>
       <w:r>
         <w:br/>
@@ -5898,15 +5982,6 @@
       </w:r>
       <w:r>
         <w:t xml:space="preserve"> </w:t>
-      </w:r>
-      <w:r>
-        <w:rPr>
-          <w:rStyle w:val="VerbatimChar"/>
-        </w:rPr>
-        <w:t xml:space="preserve">/healthz</w:t>
-      </w:r>
-      <w:r>
-        <w:t xml:space="preserve">/</w:t>
       </w:r>
       <w:r>
         <w:rPr>
@@ -5945,19 +6020,97 @@
         <w:t xml:space="preserve">patterns / deployment options</w:t>
       </w:r>
       <w:r>
-        <w:t xml:space="preserve">, not all wired into the binaries in this checkout. The</w:t>
-      </w:r>
-      <w:r>
-        <w:t xml:space="preserve"> </w:t>
-      </w:r>
-      <w:r>
-        <w:t xml:space="preserve">authoritative per-binary endpoints are the ones in the table above (</w:t>
+        <w:t xml:space="preserve">, not all wired into the binaries in this checkout. (</w:t>
+      </w:r>
+      <w:r>
+        <w:rPr>
+          <w:rStyle w:val="VerbatimChar"/>
+        </w:rPr>
+        <w:t xml:space="preserve">helixd</w:t>
+      </w:r>
+      <w:r>
+        <w:t xml:space="preserve"> </w:t>
+      </w:r>
+      <w:r>
+        <w:t xml:space="preserve">does serve</w:t>
+      </w:r>
+      <w:r>
+        <w:t xml:space="preserve"> </w:t>
+      </w:r>
+      <w:r>
+        <w:rPr>
+          <w:rStyle w:val="VerbatimChar"/>
+        </w:rPr>
+        <w:t xml:space="preserve">/healthz</w:t>
+      </w:r>
+      <w:r>
+        <w:t xml:space="preserve"> </w:t>
+      </w:r>
+      <w:r>
+        <w:t xml:space="preserve">— and</w:t>
+      </w:r>
+      <w:r>
+        <w:t xml:space="preserve"> </w:t>
+      </w:r>
+      <w:r>
+        <w:rPr>
+          <w:rStyle w:val="VerbatimChar"/>
+        </w:rPr>
+        <w:t xml:space="preserve">/health</w:t>
+      </w:r>
+      <w:r>
+        <w:t xml:space="preserve"> </w:t>
+      </w:r>
+      <w:r>
+        <w:t xml:space="preserve">— as aliases of</w:t>
+      </w:r>
+      <w:r>
+        <w:t xml:space="preserve"> </w:t>
       </w:r>
       <w:r>
         <w:rPr>
           <w:rStyle w:val="VerbatimChar"/>
         </w:rPr>
         <w:t xml:space="preserve">/status</w:t>
+      </w:r>
+      <w:r>
+        <w:t xml:space="preserve">, so liveness probes against the</w:t>
+      </w:r>
+      <w:r>
+        <w:t xml:space="preserve"> </w:t>
+      </w:r>
+      <w:r>
+        <w:t xml:space="preserve">conventional path work today.) The authoritative per-binary endpoints are the ones in the table</w:t>
+      </w:r>
+      <w:r>
+        <w:t xml:space="preserve"> </w:t>
+      </w:r>
+      <w:r>
+        <w:t xml:space="preserve">above (</w:t>
+      </w:r>
+      <w:r>
+        <w:rPr>
+          <w:rStyle w:val="VerbatimChar"/>
+        </w:rPr>
+        <w:t xml:space="preserve">/status</w:t>
+      </w:r>
+      <w:r>
+        <w:t xml:space="preserve">+</w:t>
+      </w:r>
+      <w:r>
+        <w:rPr>
+          <w:rStyle w:val="VerbatimChar"/>
+        </w:rPr>
+        <w:t xml:space="preserve">/health</w:t>
+      </w:r>
+      <w:r>
+        <w:t xml:space="preserve">+</w:t>
+      </w:r>
+      <w:r>
+        <w:rPr>
+          <w:rStyle w:val="VerbatimChar"/>
+        </w:rPr>
+        <w:t xml:space="preserve">/healthz</w:t>
       </w:r>
       <w:r>
         <w:t xml:space="preserve">,</w:t>
@@ -8365,7 +8518,31 @@
         <w:t xml:space="preserve"> </w:t>
       </w:r>
       <w:r>
-        <w:t xml:space="preserve">surface, graceful shutdown</w:t>
+        <w:t xml:space="preserve">surface (with</w:t>
+      </w:r>
+      <w:r>
+        <w:t xml:space="preserve"> </w:t>
+      </w:r>
+      <w:r>
+        <w:rPr>
+          <w:rStyle w:val="VerbatimChar"/>
+        </w:rPr>
+        <w:t xml:space="preserve">/health</w:t>
+      </w:r>
+      <w:r>
+        <w:t xml:space="preserve">+</w:t>
+      </w:r>
+      <w:r>
+        <w:rPr>
+          <w:rStyle w:val="VerbatimChar"/>
+        </w:rPr>
+        <w:t xml:space="preserve">/healthz</w:t>
+      </w:r>
+      <w:r>
+        <w:t xml:space="preserve"> </w:t>
+      </w:r>
+      <w:r>
+        <w:t xml:space="preserve">aliases), graceful shutdown</w:t>
       </w:r>
     </w:p>
     <w:p>

</xml_diff>